<commit_message>
feat: add 52-week AI learning path, app, and GitHub Pages deploy
Add ai-factory curriculum (lab, slides, learning app), agent tooling,
BRD governance updates, and Pages workflow for learning app + BRD intake.

Co-authored-by: Cursor <cursoragent@cursor.com>
</commit_message>
<xml_diff>
--- a/exports/FE-Credit-BRD-Cheat-Sheet.docx
+++ b/exports/FE-Credit-BRD-Cheat-Sheet.docx
@@ -4,191 +4,637 @@
   <w:body>
     <w:p>
       <w:pPr>
-        <w:pStyle w:val="Title"/>
+        <w:jc w:val="left"/>
       </w:pPr>
       <w:r>
+        <w:rPr>
+          <w:rFonts w:ascii="Poppins" w:hAnsi="Poppins" w:eastAsia="Poppins" w:cs="Poppins"/>
+          <w:rFonts w:ascii="Poppins" w:hAnsi="Poppins"/>
+          <w:b/>
+          <w:i w:val="0"/>
+          <w:color w:val="141413"/>
+          <w:sz w:val="52"/>
+        </w:rPr>
         <w:t>FE Credit BRD Cheat Sheet</w:t>
       </w:r>
     </w:p>
     <w:p>
       <w:pPr>
-        <w:pStyle w:val="Heading1"/>
+        <w:spacing w:before="80"/>
       </w:pPr>
       <w:r>
+        <w:rPr>
+          <w:rFonts w:ascii="Lora" w:hAnsi="Lora" w:eastAsia="Lora" w:cs="Lora"/>
+          <w:rFonts w:ascii="Lora" w:hAnsi="Lora"/>
+          <w:b w:val="0"/>
+          <w:i w:val="0"/>
+          <w:color w:val="5E5D59"/>
+          <w:sz w:val="26"/>
+        </w:rPr>
+        <w:t>Quick reference for business authors · POS, HQ, Digital, Collections</w:t>
+      </w:r>
+    </w:p>
+    <w:p>
+      <w:pPr>
+        <w:spacing w:before="40"/>
+      </w:pPr>
+      <w:r>
+        <w:rPr>
+          <w:rFonts w:ascii="Lora" w:hAnsi="Lora" w:eastAsia="Lora" w:cs="Lora"/>
+          <w:rFonts w:ascii="Lora" w:hAnsi="Lora"/>
+          <w:b w:val="0"/>
+          <w:i/>
+          <w:color w:val="B0AEA5"/>
+          <w:sz w:val="20"/>
+        </w:rPr>
+        <w:t>Internal use only</w:t>
+      </w:r>
+    </w:p>
+    <w:p>
+      <w:pPr>
+        <w:spacing w:before="240" w:after="320"/>
+        <w:pBdr>
+          <w:bottom w:val="single" w:sz="18" w:space="1" w:color="D97757"/>
+        </w:pBdr>
+      </w:pPr>
+    </w:p>
+    <w:p>
+      <w:pPr>
+        <w:spacing w:before="160" w:after="240"/>
+        <w:ind w:left="288"/>
+        <w:pBdr>
+          <w:left w:val="single" w:sz="24" w:space="4" w:color="D97757"/>
+        </w:pBdr>
+        <w:shd w:fill="F0EEE6"/>
+      </w:pPr>
+      <w:r>
+        <w:rPr>
+          <w:rFonts w:ascii="Lora" w:hAnsi="Lora" w:eastAsia="Lora" w:cs="Lora"/>
+          <w:rFonts w:ascii="Lora" w:hAnsi="Lora"/>
+          <w:b w:val="0"/>
+          <w:i w:val="0"/>
+          <w:color w:val="141413"/>
+          <w:sz w:val="21"/>
+        </w:rPr>
+        <w:t>Golden rule: write the problem and business rules — not the system design. Aim for ≥ 80% on the BRD quality gate before IT intake.</w:t>
+      </w:r>
+    </w:p>
+    <w:p>
+      <w:pPr>
+        <w:spacing w:before="360" w:after="160"/>
+        <w:ind w:left="173"/>
+        <w:pBdr>
+          <w:left w:val="single" w:sz="20" w:space="4" w:color="D97757"/>
+        </w:pBdr>
+      </w:pPr>
+      <w:r>
+        <w:rPr>
+          <w:rFonts w:ascii="Poppins" w:hAnsi="Poppins" w:eastAsia="Poppins" w:cs="Poppins"/>
+          <w:rFonts w:ascii="Poppins" w:hAnsi="Poppins"/>
+          <w:b/>
+          <w:i w:val="0"/>
+          <w:color w:val="141413"/>
+          <w:sz w:val="28"/>
+        </w:rPr>
         <w:t>Tiếng Việt (POS / hiện trường)</w:t>
       </w:r>
     </w:p>
     <w:p>
       <w:pPr>
-        <w:pStyle w:val="ListNumber"/>
+        <w:spacing w:after="100"/>
+        <w:ind w:left="288"/>
       </w:pPr>
       <w:r>
-        <w:t>1. Bắt đầu bằng vấn đề — không bắt đầu bằng hệ thống</w:t>
+        <w:rPr>
+          <w:rFonts w:ascii="Lora" w:hAnsi="Lora" w:eastAsia="Lora" w:cs="Lora"/>
+          <w:rFonts w:ascii="Lora" w:hAnsi="Lora"/>
+          <w:b/>
+          <w:i w:val="0"/>
+          <w:color w:val="D97757"/>
+          <w:sz w:val="22"/>
+        </w:rPr>
+        <w:t xml:space="preserve">1. </w:t>
+      </w:r>
+      <w:r>
+        <w:rPr>
+          <w:rFonts w:ascii="Lora" w:hAnsi="Lora" w:eastAsia="Lora" w:cs="Lora"/>
+          <w:rFonts w:ascii="Lora" w:hAnsi="Lora"/>
+          <w:b w:val="0"/>
+          <w:i w:val="0"/>
+          <w:color w:val="141413"/>
+          <w:sz w:val="22"/>
+        </w:rPr>
+        <w:t>Bắt đầu bằng vấn đề — không bắt đầu bằng hệ thống</w:t>
       </w:r>
     </w:p>
     <w:p>
       <w:pPr>
-        <w:pStyle w:val="ListNumber"/>
+        <w:spacing w:after="100"/>
+        <w:ind w:left="288"/>
       </w:pPr>
       <w:r>
-        <w:t>2. Có số liệu: %, giờ, số KH</w:t>
+        <w:rPr>
+          <w:rFonts w:ascii="Lora" w:hAnsi="Lora" w:eastAsia="Lora" w:cs="Lora"/>
+          <w:rFonts w:ascii="Lora" w:hAnsi="Lora"/>
+          <w:b/>
+          <w:i w:val="0"/>
+          <w:color w:val="D97757"/>
+          <w:sz w:val="22"/>
+        </w:rPr>
+        <w:t xml:space="preserve">2. </w:t>
+      </w:r>
+      <w:r>
+        <w:rPr>
+          <w:rFonts w:ascii="Lora" w:hAnsi="Lora" w:eastAsia="Lora" w:cs="Lora"/>
+          <w:rFonts w:ascii="Lora" w:hAnsi="Lora"/>
+          <w:b w:val="0"/>
+          <w:i w:val="0"/>
+          <w:color w:val="141413"/>
+          <w:sz w:val="22"/>
+        </w:rPr>
+        <w:t>Có số liệu: %, giờ, số KH</w:t>
       </w:r>
     </w:p>
     <w:p>
       <w:pPr>
-        <w:pStyle w:val="ListNumber"/>
+        <w:spacing w:after="100"/>
+        <w:ind w:left="288"/>
       </w:pPr>
       <w:r>
-        <w:t>3. Ghi rõ ai dùng: vai trò, số người, địa điểm</w:t>
+        <w:rPr>
+          <w:rFonts w:ascii="Lora" w:hAnsi="Lora" w:eastAsia="Lora" w:cs="Lora"/>
+          <w:rFonts w:ascii="Lora" w:hAnsi="Lora"/>
+          <w:b/>
+          <w:i w:val="0"/>
+          <w:color w:val="D97757"/>
+          <w:sz w:val="22"/>
+        </w:rPr>
+        <w:t xml:space="preserve">3. </w:t>
+      </w:r>
+      <w:r>
+        <w:rPr>
+          <w:rFonts w:ascii="Lora" w:hAnsi="Lora" w:eastAsia="Lora" w:cs="Lora"/>
+          <w:rFonts w:ascii="Lora" w:hAnsi="Lora"/>
+          <w:b w:val="0"/>
+          <w:i w:val="0"/>
+          <w:color w:val="141413"/>
+          <w:sz w:val="22"/>
+        </w:rPr>
+        <w:t>Ghi rõ ai dùng: vai trò, số người, địa điểm</w:t>
       </w:r>
     </w:p>
     <w:p>
       <w:pPr>
-        <w:pStyle w:val="ListNumber"/>
+        <w:spacing w:after="100"/>
+        <w:ind w:left="288"/>
       </w:pPr>
       <w:r>
-        <w:t>4. Quy tắc nghiệp vụ: ai duyệt, giờ cắt, ngoại lệ</w:t>
+        <w:rPr>
+          <w:rFonts w:ascii="Lora" w:hAnsi="Lora" w:eastAsia="Lora" w:cs="Lora"/>
+          <w:rFonts w:ascii="Lora" w:hAnsi="Lora"/>
+          <w:b/>
+          <w:i w:val="0"/>
+          <w:color w:val="D97757"/>
+          <w:sz w:val="22"/>
+        </w:rPr>
+        <w:t xml:space="preserve">4. </w:t>
+      </w:r>
+      <w:r>
+        <w:rPr>
+          <w:rFonts w:ascii="Lora" w:hAnsi="Lora" w:eastAsia="Lora" w:cs="Lora"/>
+          <w:rFonts w:ascii="Lora" w:hAnsi="Lora"/>
+          <w:b w:val="0"/>
+          <w:i w:val="0"/>
+          <w:color w:val="141413"/>
+          <w:sz w:val="22"/>
+        </w:rPr>
+        <w:t>Quy tắc nghiệp vụ: ai duyệt, giờ cắt, ngoại lệ</w:t>
       </w:r>
     </w:p>
     <w:p>
       <w:pPr>
-        <w:pStyle w:val="ListNumber"/>
+        <w:spacing w:after="100"/>
+        <w:ind w:left="288"/>
       </w:pPr>
       <w:r>
-        <w:t>5. Trong phạm vi + ngoài phạm vi</w:t>
+        <w:rPr>
+          <w:rFonts w:ascii="Lora" w:hAnsi="Lora" w:eastAsia="Lora" w:cs="Lora"/>
+          <w:rFonts w:ascii="Lora" w:hAnsi="Lora"/>
+          <w:b/>
+          <w:i w:val="0"/>
+          <w:color w:val="D97757"/>
+          <w:sz w:val="22"/>
+        </w:rPr>
+        <w:t xml:space="preserve">5. </w:t>
+      </w:r>
+      <w:r>
+        <w:rPr>
+          <w:rFonts w:ascii="Lora" w:hAnsi="Lora" w:eastAsia="Lora" w:cs="Lora"/>
+          <w:rFonts w:ascii="Lora" w:hAnsi="Lora"/>
+          <w:b w:val="0"/>
+          <w:i w:val="0"/>
+          <w:color w:val="141413"/>
+          <w:sz w:val="22"/>
+        </w:rPr>
+        <w:t>Trong phạm vi + ngoài phạm vi</w:t>
       </w:r>
     </w:p>
     <w:p>
       <w:pPr>
-        <w:pStyle w:val="ListNumber"/>
+        <w:spacing w:after="100"/>
+        <w:ind w:left="288"/>
       </w:pPr>
       <w:r>
-        <w:t>6. Dữ liệu &amp; tuân thủ: PII, CIC, SMS</w:t>
+        <w:rPr>
+          <w:rFonts w:ascii="Lora" w:hAnsi="Lora" w:eastAsia="Lora" w:cs="Lora"/>
+          <w:rFonts w:ascii="Lora" w:hAnsi="Lora"/>
+          <w:b/>
+          <w:i w:val="0"/>
+          <w:color w:val="D97757"/>
+          <w:sz w:val="22"/>
+        </w:rPr>
+        <w:t xml:space="preserve">6. </w:t>
+      </w:r>
+      <w:r>
+        <w:rPr>
+          <w:rFonts w:ascii="Lora" w:hAnsi="Lora" w:eastAsia="Lora" w:cs="Lora"/>
+          <w:rFonts w:ascii="Lora" w:hAnsi="Lora"/>
+          <w:b w:val="0"/>
+          <w:i w:val="0"/>
+          <w:color w:val="141413"/>
+          <w:sz w:val="22"/>
+        </w:rPr>
+        <w:t>Dữ liệu &amp; tuân thủ: PII, CIC, SMS</w:t>
       </w:r>
     </w:p>
     <w:p>
       <w:pPr>
-        <w:pStyle w:val="ListNumber"/>
+        <w:spacing w:after="100"/>
+        <w:ind w:left="288"/>
       </w:pPr>
       <w:r>
-        <w:t>7. Tiêu chí nghiệm thu: Cho trước / Khi / Thì (≥5)</w:t>
+        <w:rPr>
+          <w:rFonts w:ascii="Lora" w:hAnsi="Lora" w:eastAsia="Lora" w:cs="Lora"/>
+          <w:rFonts w:ascii="Lora" w:hAnsi="Lora"/>
+          <w:b/>
+          <w:i w:val="0"/>
+          <w:color w:val="D97757"/>
+          <w:sz w:val="22"/>
+        </w:rPr>
+        <w:t xml:space="preserve">7. </w:t>
+      </w:r>
+      <w:r>
+        <w:rPr>
+          <w:rFonts w:ascii="Lora" w:hAnsi="Lora" w:eastAsia="Lora" w:cs="Lora"/>
+          <w:rFonts w:ascii="Lora" w:hAnsi="Lora"/>
+          <w:b w:val="0"/>
+          <w:i w:val="0"/>
+          <w:color w:val="141413"/>
+          <w:sz w:val="22"/>
+        </w:rPr>
+        <w:t>Tiêu chí nghiệm thu: Cho trước / Khi / Thì (≥5)</w:t>
       </w:r>
     </w:p>
     <w:p>
       <w:pPr>
-        <w:pStyle w:val="ListNumber"/>
+        <w:spacing w:after="100"/>
+        <w:ind w:left="288"/>
       </w:pPr>
       <w:r>
-        <w:t>8. Xin Sponsor (Giám đốc+) ký trước khi gửi IT</w:t>
+        <w:rPr>
+          <w:rFonts w:ascii="Lora" w:hAnsi="Lora" w:eastAsia="Lora" w:cs="Lora"/>
+          <w:rFonts w:ascii="Lora" w:hAnsi="Lora"/>
+          <w:b/>
+          <w:i w:val="0"/>
+          <w:color w:val="D97757"/>
+          <w:sz w:val="22"/>
+        </w:rPr>
+        <w:t xml:space="preserve">8. </w:t>
+      </w:r>
+      <w:r>
+        <w:rPr>
+          <w:rFonts w:ascii="Lora" w:hAnsi="Lora" w:eastAsia="Lora" w:cs="Lora"/>
+          <w:rFonts w:ascii="Lora" w:hAnsi="Lora"/>
+          <w:b w:val="0"/>
+          <w:i w:val="0"/>
+          <w:color w:val="141413"/>
+          <w:sz w:val="22"/>
+        </w:rPr>
+        <w:t>Xin Sponsor (Giám đốc+) ký trước khi gửi IT</w:t>
       </w:r>
     </w:p>
     <w:p>
       <w:pPr>
-        <w:pStyle w:val="Heading1"/>
+        <w:spacing w:before="360" w:after="160"/>
+        <w:ind w:left="173"/>
+        <w:pBdr>
+          <w:left w:val="single" w:sz="20" w:space="4" w:color="6A9BCC"/>
+        </w:pBdr>
       </w:pPr>
       <w:r>
+        <w:rPr>
+          <w:rFonts w:ascii="Poppins" w:hAnsi="Poppins" w:eastAsia="Poppins" w:cs="Poppins"/>
+          <w:rFonts w:ascii="Poppins" w:hAnsi="Poppins"/>
+          <w:b/>
+          <w:i w:val="0"/>
+          <w:color w:val="141413"/>
+          <w:sz w:val="28"/>
+        </w:rPr>
         <w:t>English (HQ / Digital / Collections)</w:t>
       </w:r>
     </w:p>
     <w:p>
       <w:pPr>
-        <w:pStyle w:val="ListNumber"/>
+        <w:spacing w:after="100"/>
+        <w:ind w:left="288"/>
       </w:pPr>
       <w:r>
-        <w:t>1. Start with the problem, not the system</w:t>
+        <w:rPr>
+          <w:rFonts w:ascii="Lora" w:hAnsi="Lora" w:eastAsia="Lora" w:cs="Lora"/>
+          <w:rFonts w:ascii="Lora" w:hAnsi="Lora"/>
+          <w:b/>
+          <w:i w:val="0"/>
+          <w:color w:val="D97757"/>
+          <w:sz w:val="22"/>
+        </w:rPr>
+        <w:t xml:space="preserve">1. </w:t>
+      </w:r>
+      <w:r>
+        <w:rPr>
+          <w:rFonts w:ascii="Lora" w:hAnsi="Lora" w:eastAsia="Lora" w:cs="Lora"/>
+          <w:rFonts w:ascii="Lora" w:hAnsi="Lora"/>
+          <w:b w:val="0"/>
+          <w:i w:val="0"/>
+          <w:color w:val="141413"/>
+          <w:sz w:val="22"/>
+        </w:rPr>
+        <w:t>Start with the problem, not the system</w:t>
       </w:r>
     </w:p>
     <w:p>
       <w:pPr>
-        <w:pStyle w:val="ListNumber"/>
+        <w:spacing w:after="100"/>
+        <w:ind w:left="288"/>
       </w:pPr>
       <w:r>
-        <w:t>2. Quantify impact: %, hours, customers, VND</w:t>
+        <w:rPr>
+          <w:rFonts w:ascii="Lora" w:hAnsi="Lora" w:eastAsia="Lora" w:cs="Lora"/>
+          <w:rFonts w:ascii="Lora" w:hAnsi="Lora"/>
+          <w:b/>
+          <w:i w:val="0"/>
+          <w:color w:val="D97757"/>
+          <w:sz w:val="22"/>
+        </w:rPr>
+        <w:t xml:space="preserve">2. </w:t>
+      </w:r>
+      <w:r>
+        <w:rPr>
+          <w:rFonts w:ascii="Lora" w:hAnsi="Lora" w:eastAsia="Lora" w:cs="Lora"/>
+          <w:rFonts w:ascii="Lora" w:hAnsi="Lora"/>
+          <w:b w:val="0"/>
+          <w:i w:val="0"/>
+          <w:color w:val="141413"/>
+          <w:sz w:val="22"/>
+        </w:rPr>
+        <w:t>Quantify impact: %, hours, customers, VND</w:t>
       </w:r>
     </w:p>
     <w:p>
       <w:pPr>
-        <w:pStyle w:val="ListNumber"/>
+        <w:spacing w:after="100"/>
+        <w:ind w:left="288"/>
       </w:pPr>
       <w:r>
-        <w:t>3. Define who uses it: role, count, location</w:t>
+        <w:rPr>
+          <w:rFonts w:ascii="Lora" w:hAnsi="Lora" w:eastAsia="Lora" w:cs="Lora"/>
+          <w:rFonts w:ascii="Lora" w:hAnsi="Lora"/>
+          <w:b/>
+          <w:i w:val="0"/>
+          <w:color w:val="D97757"/>
+          <w:sz w:val="22"/>
+        </w:rPr>
+        <w:t xml:space="preserve">3. </w:t>
+      </w:r>
+      <w:r>
+        <w:rPr>
+          <w:rFonts w:ascii="Lora" w:hAnsi="Lora" w:eastAsia="Lora" w:cs="Lora"/>
+          <w:rFonts w:ascii="Lora" w:hAnsi="Lora"/>
+          <w:b w:val="0"/>
+          <w:i w:val="0"/>
+          <w:color w:val="141413"/>
+          <w:sz w:val="22"/>
+        </w:rPr>
+        <w:t>Define who uses it: role, count, location</w:t>
       </w:r>
     </w:p>
     <w:p>
       <w:pPr>
-        <w:pStyle w:val="ListNumber"/>
+        <w:spacing w:after="100"/>
+        <w:ind w:left="288"/>
       </w:pPr>
       <w:r>
-        <w:t>4. Document business rules: approval, cut-off, exceptions</w:t>
+        <w:rPr>
+          <w:rFonts w:ascii="Lora" w:hAnsi="Lora" w:eastAsia="Lora" w:cs="Lora"/>
+          <w:rFonts w:ascii="Lora" w:hAnsi="Lora"/>
+          <w:b/>
+          <w:i w:val="0"/>
+          <w:color w:val="D97757"/>
+          <w:sz w:val="22"/>
+        </w:rPr>
+        <w:t xml:space="preserve">4. </w:t>
+      </w:r>
+      <w:r>
+        <w:rPr>
+          <w:rFonts w:ascii="Lora" w:hAnsi="Lora" w:eastAsia="Lora" w:cs="Lora"/>
+          <w:rFonts w:ascii="Lora" w:hAnsi="Lora"/>
+          <w:b w:val="0"/>
+          <w:i w:val="0"/>
+          <w:color w:val="141413"/>
+          <w:sz w:val="22"/>
+        </w:rPr>
+        <w:t>Document business rules: approval, cut-off, exceptions</w:t>
       </w:r>
     </w:p>
     <w:p>
       <w:pPr>
-        <w:pStyle w:val="ListNumber"/>
+        <w:spacing w:after="100"/>
+        <w:ind w:left="288"/>
       </w:pPr>
       <w:r>
-        <w:t>5. Write in-scope AND out-of-scope</w:t>
+        <w:rPr>
+          <w:rFonts w:ascii="Lora" w:hAnsi="Lora" w:eastAsia="Lora" w:cs="Lora"/>
+          <w:rFonts w:ascii="Lora" w:hAnsi="Lora"/>
+          <w:b/>
+          <w:i w:val="0"/>
+          <w:color w:val="D97757"/>
+          <w:sz w:val="22"/>
+        </w:rPr>
+        <w:t xml:space="preserve">5. </w:t>
+      </w:r>
+      <w:r>
+        <w:rPr>
+          <w:rFonts w:ascii="Lora" w:hAnsi="Lora" w:eastAsia="Lora" w:cs="Lora"/>
+          <w:rFonts w:ascii="Lora" w:hAnsi="Lora"/>
+          <w:b w:val="0"/>
+          <w:i w:val="0"/>
+          <w:color w:val="141413"/>
+          <w:sz w:val="22"/>
+        </w:rPr>
+        <w:t>Write in-scope AND out-of-scope</w:t>
       </w:r>
     </w:p>
     <w:p>
       <w:pPr>
-        <w:pStyle w:val="ListNumber"/>
+        <w:spacing w:after="100"/>
+        <w:ind w:left="288"/>
       </w:pPr>
       <w:r>
-        <w:t>6. Complete data &amp; compliance section honestly</w:t>
+        <w:rPr>
+          <w:rFonts w:ascii="Lora" w:hAnsi="Lora" w:eastAsia="Lora" w:cs="Lora"/>
+          <w:rFonts w:ascii="Lora" w:hAnsi="Lora"/>
+          <w:b/>
+          <w:i w:val="0"/>
+          <w:color w:val="D97757"/>
+          <w:sz w:val="22"/>
+        </w:rPr>
+        <w:t xml:space="preserve">6. </w:t>
+      </w:r>
+      <w:r>
+        <w:rPr>
+          <w:rFonts w:ascii="Lora" w:hAnsi="Lora" w:eastAsia="Lora" w:cs="Lora"/>
+          <w:rFonts w:ascii="Lora" w:hAnsi="Lora"/>
+          <w:b w:val="0"/>
+          <w:i w:val="0"/>
+          <w:color w:val="141413"/>
+          <w:sz w:val="22"/>
+        </w:rPr>
+        <w:t>Complete data &amp; compliance section honestly</w:t>
       </w:r>
     </w:p>
     <w:p>
       <w:pPr>
-        <w:pStyle w:val="ListNumber"/>
+        <w:spacing w:after="100"/>
+        <w:ind w:left="288"/>
       </w:pPr>
       <w:r>
-        <w:t>7. Add acceptance criteria: Given/When/Then (min 5)</w:t>
+        <w:rPr>
+          <w:rFonts w:ascii="Lora" w:hAnsi="Lora" w:eastAsia="Lora" w:cs="Lora"/>
+          <w:rFonts w:ascii="Lora" w:hAnsi="Lora"/>
+          <w:b/>
+          <w:i w:val="0"/>
+          <w:color w:val="D97757"/>
+          <w:sz w:val="22"/>
+        </w:rPr>
+        <w:t xml:space="preserve">7. </w:t>
+      </w:r>
+      <w:r>
+        <w:rPr>
+          <w:rFonts w:ascii="Lora" w:hAnsi="Lora" w:eastAsia="Lora" w:cs="Lora"/>
+          <w:rFonts w:ascii="Lora" w:hAnsi="Lora"/>
+          <w:b w:val="0"/>
+          <w:i w:val="0"/>
+          <w:color w:val="141413"/>
+          <w:sz w:val="22"/>
+        </w:rPr>
+        <w:t>Add acceptance criteria: Given/When/Then (min 5)</w:t>
       </w:r>
     </w:p>
     <w:p>
       <w:pPr>
-        <w:pStyle w:val="ListNumber"/>
+        <w:spacing w:after="100"/>
+        <w:ind w:left="288"/>
       </w:pPr>
       <w:r>
-        <w:t>8. Get Sponsor sign-off before IT intake</w:t>
+        <w:rPr>
+          <w:rFonts w:ascii="Lora" w:hAnsi="Lora" w:eastAsia="Lora" w:cs="Lora"/>
+          <w:rFonts w:ascii="Lora" w:hAnsi="Lora"/>
+          <w:b/>
+          <w:i w:val="0"/>
+          <w:color w:val="D97757"/>
+          <w:sz w:val="22"/>
+        </w:rPr>
+        <w:t xml:space="preserve">8. </w:t>
+      </w:r>
+      <w:r>
+        <w:rPr>
+          <w:rFonts w:ascii="Lora" w:hAnsi="Lora" w:eastAsia="Lora" w:cs="Lora"/>
+          <w:rFonts w:ascii="Lora" w:hAnsi="Lora"/>
+          <w:b w:val="0"/>
+          <w:i w:val="0"/>
+          <w:color w:val="141413"/>
+          <w:sz w:val="22"/>
+        </w:rPr>
+        <w:t>Get Sponsor sign-off before IT intake</w:t>
       </w:r>
     </w:p>
     <w:p>
       <w:pPr>
-        <w:pStyle w:val="Heading1"/>
+        <w:spacing w:before="360" w:after="160"/>
+        <w:ind w:left="173"/>
+        <w:pBdr>
+          <w:left w:val="single" w:sz="20" w:space="4" w:color="788C5D"/>
+        </w:pBdr>
       </w:pPr>
       <w:r>
+        <w:rPr>
+          <w:rFonts w:ascii="Poppins" w:hAnsi="Poppins" w:eastAsia="Poppins" w:cs="Poppins"/>
+          <w:rFonts w:ascii="Poppins" w:hAnsi="Poppins"/>
+          <w:b/>
+          <w:i w:val="0"/>
+          <w:color w:val="141413"/>
+          <w:sz w:val="28"/>
+        </w:rPr>
         <w:t>Compliance triggers → Route to</w:t>
       </w:r>
     </w:p>
     <w:tbl>
       <w:tblPr>
-        <w:tblStyle w:val="TableGrid"/>
         <w:tblW w:type="auto" w:w="0"/>
+        <w:jc w:val="center"/>
+        <w:tblLayout w:type="autofit"/>
         <w:tblLook w:firstColumn="1" w:firstRow="1" w:lastColumn="0" w:lastRow="0" w:noHBand="0" w:noVBand="1" w:val="04A0"/>
       </w:tblPr>
       <w:tblGrid>
-        <w:gridCol w:w="4320"/>
-        <w:gridCol w:w="4320"/>
+        <w:gridCol w:w="4680"/>
+        <w:gridCol w:w="4680"/>
       </w:tblGrid>
       <w:tr>
         <w:tc>
           <w:tcPr>
-            <w:tcW w:type="dxa" w:w="4320"/>
+            <w:tcW w:type="dxa" w:w="4680"/>
+            <w:shd w:fill="141413"/>
           </w:tcPr>
           <w:p>
+            <w:r/>
             <w:r>
+              <w:rPr>
+                <w:rFonts w:ascii="Poppins" w:hAnsi="Poppins" w:eastAsia="Poppins" w:cs="Poppins"/>
+                <w:rFonts w:ascii="Poppins" w:hAnsi="Poppins"/>
+                <w:b/>
+                <w:i w:val="0"/>
+                <w:color w:val="FFFFFF"/>
+                <w:sz w:val="20"/>
+              </w:rPr>
               <w:t>If BRD includes...</w:t>
             </w:r>
           </w:p>
         </w:tc>
         <w:tc>
           <w:tcPr>
-            <w:tcW w:type="dxa" w:w="4320"/>
+            <w:tcW w:type="dxa" w:w="4680"/>
+            <w:shd w:fill="141413"/>
           </w:tcPr>
           <w:p>
+            <w:r/>
             <w:r>
+              <w:rPr>
+                <w:rFonts w:ascii="Poppins" w:hAnsi="Poppins" w:eastAsia="Poppins" w:cs="Poppins"/>
+                <w:rFonts w:ascii="Poppins" w:hAnsi="Poppins"/>
+                <w:b/>
+                <w:i w:val="0"/>
+                <w:color w:val="FFFFFF"/>
+                <w:sz w:val="20"/>
+              </w:rPr>
               <w:t>Route to</w:t>
             </w:r>
           </w:p>
@@ -197,7 +643,7 @@
       <w:tr>
         <w:tc>
           <w:tcPr>
-            <w:tcW w:type="dxa" w:w="4320"/>
+            <w:tcW w:type="dxa" w:w="4680"/>
           </w:tcPr>
           <w:p>
             <w:r>
@@ -207,7 +653,7 @@
         </w:tc>
         <w:tc>
           <w:tcPr>
-            <w:tcW w:type="dxa" w:w="4320"/>
+            <w:tcW w:type="dxa" w:w="4680"/>
           </w:tcPr>
           <w:p>
             <w:r>
@@ -219,7 +665,7 @@
       <w:tr>
         <w:tc>
           <w:tcPr>
-            <w:tcW w:type="dxa" w:w="4320"/>
+            <w:tcW w:type="dxa" w:w="4680"/>
           </w:tcPr>
           <w:p>
             <w:r>
@@ -229,7 +675,7 @@
         </w:tc>
         <w:tc>
           <w:tcPr>
-            <w:tcW w:type="dxa" w:w="4320"/>
+            <w:tcW w:type="dxa" w:w="4680"/>
           </w:tcPr>
           <w:p>
             <w:r>
@@ -241,7 +687,7 @@
       <w:tr>
         <w:tc>
           <w:tcPr>
-            <w:tcW w:type="dxa" w:w="4320"/>
+            <w:tcW w:type="dxa" w:w="4680"/>
           </w:tcPr>
           <w:p>
             <w:r>
@@ -251,7 +697,7 @@
         </w:tc>
         <w:tc>
           <w:tcPr>
-            <w:tcW w:type="dxa" w:w="4320"/>
+            <w:tcW w:type="dxa" w:w="4680"/>
           </w:tcPr>
           <w:p>
             <w:r>
@@ -263,7 +709,7 @@
       <w:tr>
         <w:tc>
           <w:tcPr>
-            <w:tcW w:type="dxa" w:w="4320"/>
+            <w:tcW w:type="dxa" w:w="4680"/>
           </w:tcPr>
           <w:p>
             <w:r>
@@ -273,7 +719,7 @@
         </w:tc>
         <w:tc>
           <w:tcPr>
-            <w:tcW w:type="dxa" w:w="4320"/>
+            <w:tcW w:type="dxa" w:w="4680"/>
           </w:tcPr>
           <w:p>
             <w:r>
@@ -285,7 +731,7 @@
       <w:tr>
         <w:tc>
           <w:tcPr>
-            <w:tcW w:type="dxa" w:w="4320"/>
+            <w:tcW w:type="dxa" w:w="4680"/>
           </w:tcPr>
           <w:p>
             <w:r>
@@ -295,7 +741,7 @@
         </w:tc>
         <w:tc>
           <w:tcPr>
-            <w:tcW w:type="dxa" w:w="4320"/>
+            <w:tcW w:type="dxa" w:w="4680"/>
           </w:tcPr>
           <w:p>
             <w:r>
@@ -307,7 +753,7 @@
       <w:tr>
         <w:tc>
           <w:tcPr>
-            <w:tcW w:type="dxa" w:w="4320"/>
+            <w:tcW w:type="dxa" w:w="4680"/>
           </w:tcPr>
           <w:p>
             <w:r>
@@ -317,7 +763,7 @@
         </w:tc>
         <w:tc>
           <w:tcPr>
-            <w:tcW w:type="dxa" w:w="4320"/>
+            <w:tcW w:type="dxa" w:w="4680"/>
           </w:tcPr>
           <w:p>
             <w:r>
@@ -329,7 +775,7 @@
     </w:tbl>
     <w:sectPr>
       <w:pgSz w:w="12240" w:h="15840"/>
-      <w:pgMar w:top="1440" w:right="1800" w:bottom="1440" w:left="1800" w:header="720" w:footer="720" w:gutter="0"/>
+      <w:pgMar w:top="1296" w:right="1440" w:bottom="1224" w:left="1440" w:header="720" w:footer="720" w:gutter="0"/>
       <w:cols w:space="720"/>
       <w:docGrid w:linePitch="360"/>
     </w:sectPr>
@@ -700,6 +1146,14 @@
     <w:name w:val="Normal"/>
     <w:qFormat/>
     <w:rsid w:val="00FC693F"/>
+    <w:pPr>
+      <w:spacing w:after="120" w:line="276" w:lineRule="auto"/>
+    </w:pPr>
+    <w:rPr>
+      <w:rFonts w:ascii="Lora" w:hAnsi="Lora"/>
+      <w:color w:val="141413"/>
+      <w:sz w:val="22"/>
+    </w:rPr>
   </w:style>
   <w:style w:type="paragraph" w:styleId="Header">
     <w:name w:val="header"/>
@@ -756,15 +1210,15 @@
     <w:pPr>
       <w:keepNext/>
       <w:keepLines/>
-      <w:spacing w:before="480" w:after="0"/>
+      <w:spacing w:before="280" w:after="200"/>
       <w:outlineLvl w:val="0"/>
     </w:pPr>
     <w:rPr>
-      <w:rFonts w:asciiTheme="majorHAnsi" w:eastAsiaTheme="majorEastAsia" w:hAnsiTheme="majorHAnsi" w:cstheme="majorBidi"/>
+      <w:rFonts w:asciiTheme="majorHAnsi" w:eastAsiaTheme="majorEastAsia" w:hAnsiTheme="majorHAnsi" w:cstheme="majorBidi" w:ascii="Poppins" w:hAnsi="Poppins"/>
       <w:b/>
       <w:bCs/>
-      <w:color w:val="365F91" w:themeColor="accent1" w:themeShade="BF"/>
-      <w:sz w:val="28"/>
+      <w:color w:val="141413"/>
+      <w:sz w:val="32"/>
       <w:szCs w:val="28"/>
     </w:rPr>
   </w:style>
@@ -780,14 +1234,14 @@
     <w:pPr>
       <w:keepNext/>
       <w:keepLines/>
-      <w:spacing w:before="200" w:after="0"/>
+      <w:spacing w:before="280" w:after="200"/>
       <w:outlineLvl w:val="1"/>
     </w:pPr>
     <w:rPr>
-      <w:rFonts w:asciiTheme="majorHAnsi" w:eastAsiaTheme="majorEastAsia" w:hAnsiTheme="majorHAnsi" w:cstheme="majorBidi"/>
+      <w:rFonts w:asciiTheme="majorHAnsi" w:eastAsiaTheme="majorEastAsia" w:hAnsiTheme="majorHAnsi" w:cstheme="majorBidi" w:ascii="Poppins" w:hAnsi="Poppins"/>
       <w:b/>
       <w:bCs/>
-      <w:color w:val="4F81BD" w:themeColor="accent1"/>
+      <w:color w:val="141413"/>
       <w:sz w:val="26"/>
       <w:szCs w:val="26"/>
     </w:rPr>
@@ -804,14 +1258,15 @@
     <w:pPr>
       <w:keepNext/>
       <w:keepLines/>
-      <w:spacing w:before="200" w:after="0"/>
+      <w:spacing w:before="280" w:after="200"/>
       <w:outlineLvl w:val="2"/>
     </w:pPr>
     <w:rPr>
-      <w:rFonts w:asciiTheme="majorHAnsi" w:eastAsiaTheme="majorEastAsia" w:hAnsiTheme="majorHAnsi" w:cstheme="majorBidi"/>
+      <w:rFonts w:asciiTheme="majorHAnsi" w:eastAsiaTheme="majorEastAsia" w:hAnsiTheme="majorHAnsi" w:cstheme="majorBidi" w:ascii="Poppins" w:hAnsi="Poppins"/>
       <w:b/>
       <w:bCs/>
-      <w:color w:val="4F81BD" w:themeColor="accent1"/>
+      <w:color w:val="141413"/>
+      <w:sz w:val="24"/>
     </w:rPr>
   </w:style>
   <w:style w:type="paragraph" w:styleId="Heading4">
@@ -1042,15 +1497,17 @@
     <w:qFormat/>
     <w:rsid w:val="00FC693F"/>
     <w:pPr>
+      <w:keepNext/>
       <w:pBdr>
         <w:bottom w:val="single" w:sz="8" w:space="4" w:color="4F81BD" w:themeColor="accent1"/>
       </w:pBdr>
-      <w:spacing w:after="300" w:line="240" w:lineRule="auto"/>
+      <w:spacing w:after="200" w:line="240" w:lineRule="auto" w:before="0"/>
       <w:contextualSpacing/>
     </w:pPr>
     <w:rPr>
-      <w:rFonts w:asciiTheme="majorHAnsi" w:eastAsiaTheme="majorEastAsia" w:hAnsiTheme="majorHAnsi" w:cstheme="majorBidi"/>
-      <w:color w:val="17365D" w:themeColor="text2" w:themeShade="BF"/>
+      <w:rFonts w:asciiTheme="majorHAnsi" w:eastAsiaTheme="majorEastAsia" w:hAnsiTheme="majorHAnsi" w:cstheme="majorBidi" w:ascii="Poppins" w:hAnsi="Poppins"/>
+      <w:b/>
+      <w:color w:val="141413"/>
       <w:spacing w:val="5"/>
       <w:kern w:val="28"/>
       <w:sz w:val="52"/>
@@ -1266,8 +1723,14 @@
       <w:numPr>
         <w:numId w:val="5"/>
       </w:numPr>
+      <w:spacing w:after="80"/>
       <w:contextualSpacing/>
     </w:pPr>
+    <w:rPr>
+      <w:rFonts w:ascii="Lora" w:hAnsi="Lora"/>
+      <w:color w:val="141413"/>
+      <w:sz w:val="22"/>
+    </w:rPr>
   </w:style>
   <w:style w:type="paragraph" w:styleId="ListNumber2">
     <w:name w:val="List Number 2"/>

</xml_diff>